<commit_message>
fixes and feature added, WIP
</commit_message>
<xml_diff>
--- a/files/Server-Zugangsdaten.docx
+++ b/files/Server-Zugangsdaten.docx
@@ -21,17 +21,17 @@
         <w:rPr>
           <w:b/>
         </w:rPr>
-        <w:t>Windows Server 2022</w:t>
+        <w:t>Windows Fileserver</w:t>
       </w:r>
     </w:p>
     <w:p>
       <w:r>
-        <w:t>Hostname:   WIN2022.lab.local</w:t>
+        <w:t>Hostname:   PLACEHOLDER_FILESERVER_HOST</w:t>
       </w:r>
     </w:p>
     <w:p>
       <w:r>
-        <w:t>Benutzer:   Administrator</w:t>
+        <w:t>Benutzer:   PLACEHOLDER_ADMIN_USER</w:t>
       </w:r>
     </w:p>
     <w:p>
@@ -54,17 +54,17 @@
     </w:p>
     <w:p>
       <w:r>
-        <w:t>Hostname:   DC01.lab.local</w:t>
+        <w:t>Hostname:   PLACEHOLDER_DC_HOST</w:t>
       </w:r>
     </w:p>
     <w:p>
       <w:r>
-        <w:t>Benutzer:   Administrator</w:t>
+        <w:t>Benutzer:   PLACEHOLDER_DC_USER</w:t>
       </w:r>
     </w:p>
     <w:p>
       <w:r>
-        <w:t>Passwort:   DC@dmin2024!</w:t>
+        <w:t>Passwort:   PLACEHOLDER_DC_PASSWORD</w:t>
       </w:r>
     </w:p>
     <w:p>
@@ -82,12 +82,40 @@
     </w:p>
     <w:p>
       <w:r>
-        <w:t>Server:     db.lab.local,1433</w:t>
+        <w:t>Server:     PLACEHOLDER_DB_HOST,PLACEHOLDER_DB_PORT</w:t>
       </w:r>
     </w:p>
     <w:p>
       <w:r>
-        <w:t>SA-Passwort: Sql$Admin2024!</w:t>
+        <w:t>SA-Passwort: PLACEHOLDER_SQL_PASSWORD</w:t>
+      </w:r>
+    </w:p>
+    <w:p>
+      <w:r>
+        <w:t/>
+      </w:r>
+    </w:p>
+    <w:p>
+      <w:r>
+        <w:rPr>
+          <w:b/>
+        </w:rPr>
+        <w:t>Veeam Backup</w:t>
+      </w:r>
+    </w:p>
+    <w:p>
+      <w:r>
+        <w:t>Host:       PLACEHOLDER_VEEAM_HOST</w:t>
+      </w:r>
+    </w:p>
+    <w:p>
+      <w:r>
+        <w:t>Benutzer:   PLACEHOLDER_VEEAM_USER</w:t>
+      </w:r>
+    </w:p>
+    <w:p>
+      <w:r>
+        <w:t>Passwort:   PLACEHOLDER_VEEAM_PASSWORD</w:t>
       </w:r>
     </w:p>
     <w:sectPr/>

</xml_diff>